<commit_message>
add project report and ppt
</commit_message>
<xml_diff>
--- a/N100 FINANCIAL INTELLIGENCE PLATFORM/docs/Final_Report.docx
+++ b/N100 FINANCIAL INTELLIGENCE PLATFORM/docs/Final_Report.docx
@@ -32,36 +32,7 @@
           <w:szCs w:val="50"/>
         </w:rPr>
         <w:br/>
-      </w:r>
-      <w:r>
-        <w:rPr>
-          <w:rFonts w:ascii="Times New Roman" w:hAnsi="Times New Roman" w:cs="Times New Roman"/>
-          <w:b/>
-          <w:bCs/>
-          <w:sz w:val="50"/>
-          <w:szCs w:val="50"/>
-        </w:rPr>
-        <w:t>NIFTY 100 FINANCIAL INTELLIGENCE</w:t>
-      </w:r>
-      <w:r>
-        <w:rPr>
-          <w:rFonts w:ascii="Times New Roman" w:hAnsi="Times New Roman" w:cs="Times New Roman"/>
-          <w:b/>
-          <w:bCs/>
-          <w:sz w:val="50"/>
-          <w:szCs w:val="50"/>
-        </w:rPr>
-        <w:t xml:space="preserve"> </w:t>
-      </w:r>
-      <w:r>
-        <w:rPr>
-          <w:rFonts w:ascii="Times New Roman" w:hAnsi="Times New Roman" w:cs="Times New Roman"/>
-          <w:b/>
-          <w:bCs/>
-          <w:sz w:val="50"/>
-          <w:szCs w:val="50"/>
-        </w:rPr>
-        <w:t>PLATFORM</w:t>
+        <w:t>NIFTY 100 FINANCIAL INTELLIGENCE PLATFORM</w:t>
       </w:r>
     </w:p>
     <w:p>
@@ -703,6 +674,7 @@
           <w:rFonts w:ascii="Times New Roman" w:hAnsi="Times New Roman" w:cs="Times New Roman"/>
           <w:i/>
           <w:iCs/>
+          <w:noProof/>
         </w:rPr>
         <w:drawing>
           <wp:inline distT="0" distB="0" distL="0" distR="0" wp14:anchorId="4E6F2D89" wp14:editId="692290F8">
@@ -746,6 +718,14 @@
           <w:b/>
           <w:bCs/>
         </w:rPr>
+        <w:br/>
+      </w:r>
+      <w:r>
+        <w:rPr>
+          <w:rFonts w:ascii="Times New Roman" w:hAnsi="Times New Roman" w:cs="Times New Roman"/>
+          <w:b/>
+          <w:bCs/>
+        </w:rPr>
         <w:t>Figure 3.1: Industry Market Cap Growth and Sector Dominance</w:t>
       </w:r>
     </w:p>
@@ -765,6 +745,7 @@
           <w:rFonts w:ascii="Times New Roman" w:hAnsi="Times New Roman" w:cs="Times New Roman"/>
           <w:i/>
           <w:iCs/>
+          <w:noProof/>
           <w:sz w:val="28"/>
           <w:szCs w:val="28"/>
         </w:rPr>
@@ -867,6 +848,7 @@
           <w:rFonts w:ascii="Times New Roman" w:hAnsi="Times New Roman" w:cs="Times New Roman"/>
           <w:i/>
           <w:iCs/>
+          <w:noProof/>
           <w:sz w:val="28"/>
           <w:szCs w:val="28"/>
         </w:rPr>
@@ -1098,6 +1080,7 @@
       <w:r>
         <w:rPr>
           <w:rFonts w:ascii="Times New Roman" w:hAnsi="Times New Roman" w:cs="Times New Roman"/>
+          <w:noProof/>
           <w:sz w:val="28"/>
           <w:szCs w:val="28"/>
         </w:rPr>
@@ -1784,6 +1767,7 @@
           <w:rFonts w:ascii="Times New Roman" w:hAnsi="Times New Roman" w:cs="Times New Roman"/>
           <w:i/>
           <w:iCs/>
+          <w:noProof/>
         </w:rPr>
         <w:drawing>
           <wp:inline distT="0" distB="0" distL="0" distR="0" wp14:anchorId="05AFD3C9" wp14:editId="502189B5">
@@ -1878,6 +1862,7 @@
           <w:rFonts w:ascii="Times New Roman" w:hAnsi="Times New Roman" w:cs="Times New Roman"/>
           <w:b/>
           <w:bCs/>
+          <w:noProof/>
         </w:rPr>
         <w:drawing>
           <wp:inline distT="0" distB="0" distL="0" distR="0" wp14:anchorId="60B76870" wp14:editId="19770078">
@@ -1983,9 +1968,10 @@
         <w:rPr>
           <w:b/>
           <w:bCs/>
+          <w:noProof/>
         </w:rPr>
         <w:drawing>
-          <wp:inline distT="0" distB="0" distL="0" distR="0" wp14:anchorId="5D5C5620" wp14:editId="445C06A0">
+          <wp:inline distT="0" distB="0" distL="0" distR="0" wp14:anchorId="5D5C5620" wp14:editId="4B0DCBE9">
             <wp:extent cx="6131293" cy="3038475"/>
             <wp:effectExtent l="0" t="0" r="3175" b="0"/>
             <wp:docPr id="880141841" name="Picture 21"/>
@@ -2109,6 +2095,7 @@
           <w:rFonts w:ascii="Times New Roman" w:hAnsi="Times New Roman" w:cs="Times New Roman"/>
           <w:i/>
           <w:iCs/>
+          <w:noProof/>
           <w:sz w:val="28"/>
           <w:szCs w:val="28"/>
         </w:rPr>
@@ -2246,6 +2233,7 @@
         <w:rPr>
           <w:b/>
           <w:bCs/>
+          <w:noProof/>
         </w:rPr>
         <w:drawing>
           <wp:inline distT="0" distB="0" distL="0" distR="0" wp14:anchorId="0A458B48" wp14:editId="23AD2473">
@@ -2355,6 +2343,7 @@
           <w:rFonts w:ascii="Times New Roman" w:hAnsi="Times New Roman" w:cs="Times New Roman"/>
           <w:b/>
           <w:bCs/>
+          <w:noProof/>
         </w:rPr>
         <w:drawing>
           <wp:inline distT="0" distB="0" distL="0" distR="0" wp14:anchorId="6B5794F9" wp14:editId="1C45251A">
@@ -2514,6 +2503,7 @@
           <w:rFonts w:ascii="Times New Roman" w:hAnsi="Times New Roman" w:cs="Times New Roman"/>
           <w:b/>
           <w:bCs/>
+          <w:noProof/>
         </w:rPr>
         <w:drawing>
           <wp:inline distT="0" distB="0" distL="0" distR="0" wp14:anchorId="7D6967A8" wp14:editId="67B4C061">
@@ -2623,6 +2613,7 @@
           <w:rFonts w:ascii="Times New Roman" w:hAnsi="Times New Roman" w:cs="Times New Roman"/>
           <w:b/>
           <w:bCs/>
+          <w:noProof/>
         </w:rPr>
         <w:drawing>
           <wp:inline distT="0" distB="0" distL="0" distR="0" wp14:anchorId="236683A1" wp14:editId="5A46C307">
@@ -2802,6 +2793,7 @@
           <w:rFonts w:ascii="Times New Roman" w:hAnsi="Times New Roman" w:cs="Times New Roman"/>
           <w:b/>
           <w:bCs/>
+          <w:noProof/>
         </w:rPr>
         <w:drawing>
           <wp:inline distT="0" distB="0" distL="0" distR="0" wp14:anchorId="7FFACB7C" wp14:editId="7B53D607">
@@ -2903,6 +2895,7 @@
           <w:rFonts w:ascii="Times New Roman" w:hAnsi="Times New Roman" w:cs="Times New Roman"/>
           <w:b/>
           <w:bCs/>
+          <w:noProof/>
         </w:rPr>
         <w:drawing>
           <wp:inline distT="0" distB="0" distL="0" distR="0" wp14:anchorId="4003366B" wp14:editId="48B24D7F">
@@ -8063,6 +8056,7 @@
   <w:style w:type="character" w:default="1" w:styleId="DefaultParagraphFont">
     <w:name w:val="Default Paragraph Font"/>
     <w:uiPriority w:val="1"/>
+    <w:semiHidden/>
     <w:unhideWhenUsed/>
   </w:style>
   <w:style w:type="table" w:default="1" w:styleId="TableNormal">

</xml_diff>